<commit_message>
Rapikan dashboard dan batasi pengaturan operasional
- Batasi radius 200 meter, backup 8 file, dan pilihan retensi log

- Tambahkan layar tunggu restart dan layout dua kolom

- Perbarui manual Word serta screenshot dokumentasi
</commit_message>
<xml_diff>
--- a/PANDUAN/Bot-Absensi-Pusaka-Manual-Book-Admin.docx
+++ b/PANDUAN/Bot-Absensi-Pusaka-Manual-Book-Admin.docx
@@ -59,7 +59,7 @@
         </w:rPr>
       </w:pPr>
       <w:r>
-        <w:t>Aplikasi v2.2.0 | Pembaruan panduan 14 Oktober 2026</w:t>
+        <w:t>Aplikasi v2.2.0 | Pembaruan panduan 16 Oktober 2026</w:t>
       </w:r>
     </w:p>
     <w:tbl>
@@ -1219,7 +1219,7 @@
         </w:rPr>
       </w:pPr>
       <w:r>
-        <w:t>Admin operasional mengelola user, kalender, monitoring, dan Start/Stop dari dashboard. Admin server menangani .env, instalasi/update, restart PM2, reset password admin, backup konfigurasi/key, dan restore. Jangan membagikan akses root hanya untuk pekerjaan dashboard.</w:t>
+        <w:t>Admin operasional mengelola user, kalender, timezone, pengaturan operasional, monitoring, serta Start/Stop dari dashboard. Restart untuk perubahan timezone tersedia melalui konfirmasi khusus pada deployment PM2. Admin server tetap menangani .env, instalasi/update, reset password admin, backup konfigurasi/key, dan restore. Jangan membagikan akses root hanya untuk pekerjaan dashboard.</w:t>
       </w:r>
     </w:p>
     <w:p>
@@ -1700,7 +1700,7 @@
         </w:rPr>
       </w:pPr>
       <w:r>
-        <w:t>Dashboard merupakan pusat monitoring operasional. Data diperbarui otomatis melalui API aplikasi. Hari, tanggal, dan jam mengikuti timezone aplikasi; label WIB, WITA, atau WIT menyesuaikan wilayah yang aktif.</w:t>
+        <w:t>Dashboard merupakan pusat monitoring operasional. Card disusun dua kolom dan menyesuaikan menjadi satu kolom pada layar kecil. Data diperbarui otomatis melalui API aplikasi. Hari, tanggal, dan jam mengikuti timezone aplikasi; label WIB, WITA, atau WIT menyesuaikan wilayah yang aktif.</w:t>
       </w:r>
     </w:p>
     <w:p>
@@ -2542,6 +2542,78 @@
       </w:pPr>
       <w:r>
         <w:t>Nilai tersimpan di database dan diterapkan langsung. Menurunkan limit tidak membatalkan job yang sedang berjalan; job baru menunggu kapasitas tersedia. Pengaturan dashboard tersimpan mengambil prioritas atas MAX_CONCURRENT di .env. Mulai dari 1 dan naikkan hanya sesuai kapasitas server yang sudah diukur.</w:t>
+      </w:r>
+    </w:p>
+    <w:p>
+      <w:pPr>
+        <w:pStyle w:val="Heading2"/>
+      </w:pPr>
+      <w:r>
+        <w:t>4.7 Pengaturan Operasional</w:t>
+      </w:r>
+    </w:p>
+    <w:p>
+      <w:pPr/>
+      <w:r>
+        <w:t>Atur radius geolokasi, Backup Otomatis Aktif, jumlah backup disimpan, dan Retensi Log Presensi dari card Pengaturan Operasional. Batas berlaku pada form dan API; nilai di luar pilihan ditolak.</w:t>
+      </w:r>
+    </w:p>
+    <w:p>
+      <w:pPr>
+        <w:pStyle w:val="ListBullet"/>
+      </w:pPr>
+      <w:r>
+        <w:t>Radius Geolokasi: bilangan bulat 0-200 meter. Nilai 0 menonaktifkan offset acak.</w:t>
+      </w:r>
+    </w:p>
+    <w:p>
+      <w:pPr>
+        <w:pStyle w:val="ListBullet"/>
+      </w:pPr>
+      <w:r>
+        <w:t>Jumlah Backup Disimpan: bilangan bulat 1-8 file. Default runtime 4 file.</w:t>
+      </w:r>
+    </w:p>
+    <w:p>
+      <w:pPr>
+        <w:pStyle w:val="ListBullet"/>
+      </w:pPr>
+      <w:r>
+        <w:t>Retensi Log Presensi: dropdown 3 Hari atau 7 Hari. Hanya mengatur riwayat hasil presensi pada tabel logs, bukan user, jadwal, audit, atau file log server.</w:t>
+      </w:r>
+    </w:p>
+    <w:p>
+      <w:pPr>
+        <w:pStyle w:val="ListNumber"/>
+      </w:pPr>
+      <w:r>
+        <w:t>Ubah nilai yang diperlukan, klik Simpan, lalu baca dan setujui konfirmasi. Retensi yang lebih pendek dapat menghapus data lama pada cleanup atau backup berikutnya.</w:t>
+      </w:r>
+    </w:p>
+    <w:p>
+      <w:pPr>
+        <w:pStyle w:val="ListNumber"/>
+      </w:pPr>
+      <w:r>
+        <w:t>Pastikan keterangan Tersimpan muncul. Jika backup sedang berjalan atau aplikasi sedang draining, tunggu lalu coba lagi.</w:t>
+      </w:r>
+    </w:p>
+    <w:p>
+      <w:pPr/>
+      <w:r>
+        <w:t>Perubahan disimpan sebagai operational_settings pada tabel system_settings, dicatat pada audit, dan diterapkan tanpa restart untuk proses berikutnya. Menonaktifkan backup menghentikan jadwal backup, tidak menghapus file snapshot. Pengaturan database mengalahkan default .env dan tetap tersedia setelah restart. Jika belum ada pengaturan tersimpan, radius serta backup memakai default .env dan retensi presensi 3 hari.</w:t>
+      </w:r>
+    </w:p>
+    <w:p>
+      <w:pPr/>
+      <w:r>
+        <w:t>Radius dan retention backup lama yang melampaui batas dibatasi saat startup. Retensi log lama di luar 3/7 hari tetap dibaca agar startup tidak gagal; pilih 3 atau 7 Hari saat menyimpan kembali. File .env tidak ditulis ulang oleh dashboard. Credential, key, sesi admin, AUTO_START, cron, dan path deployment tetap dikelola melalui .env.</w:t>
+      </w:r>
+    </w:p>
+    <w:p>
+      <w:pPr/>
+      <w:r>
+        <w:t>Catatan rilis: batas 200 meter/8 file, dropdown retensi, layar tunggu restart, dan tata letak terbaru dijelaskan sesuai source lokal. Saat revisi panduan ini, perubahan tersebut belum diuji atau dideploy; pastikan release terpasang sebelum mengandalkan tampilannya di production.</w:t>
       </w:r>
     </w:p>
     <w:p>
@@ -3620,7 +3692,7 @@
         </w:rPr>
       </w:pPr>
       <w:r>
-        <w:t>Audit log mencatat tindakan yang diberi audit, antara lain login/logout admin, tambah/edit/hapus user, perubahan paket, pengaturan concurrency, kalender/timezone, Start/Stop scheduler, dan backup manual. Sebagian tampil di Recent Admin Activity. Audit bukan rekaman seluruh perintah terminal atau perubahan file server.</w:t>
+        <w:t>Audit log mencatat tindakan yang diberi audit, antara lain login/logout admin, tambah/edit/hapus user, perubahan paket, concurrency, kalender/timezone, pengaturan operasional, permintaan restart timezone, Start/Stop scheduler, dan backup manual. Sebagian tampil di Recent Admin Activity. Audit bukan rekaman seluruh perintah terminal atau perubahan file server.</w:t>
       </w:r>
     </w:p>
     <w:tbl>
@@ -3883,7 +3955,7 @@
         </w:rPr>
       </w:pPr>
       <w:r>
-        <w:t>Log presensi lebih lama dari 3 hari dibersihkan saat aplikasi startup dan melalui cleanup harian pukul 00:05:10. Runtime JSONL default 7 hari dan audit default 90 hari, mengikuti konfigurasi. Runtime cleanup menggunakan umur modifikasi file. Snapshot backup dapat masih memuat log yang sudah dibersihkan dari database aktif.</w:t>
+        <w:t>Retensi log presensi dipilih pada Pengaturan Operasional: 3 Hari atau 7 Hari; default 3 hari. Log yang lebih tua dari retensi aktif dibersihkan saat startup dan cleanup harian pukul 00:05:10 sesuai timezone aplikasi. Menyimpan pengaturan tidak langsung menghapus log. Runtime JSONL default 7 hari dan audit default 90 hari tetap mengikuti .env, tidak ikut pilihan retensi presensi. Runtime cleanup memakai umur modifikasi file. Snapshot backup dapat masih memuat log yang sudah dibersihkan dari database aktif.</w:t>
       </w:r>
     </w:p>
     <w:tbl>
@@ -4443,7 +4515,7 @@
         </w:rPr>
       </w:pPr>
       <w:r>
-        <w:t>Latitude dan longitude user pada database menjadi titik pusat. Radius randomisasi berasal dari konfigurasi global.</w:t>
+        <w:t>Latitude dan longitude user pada database menjadi titik pusat. Radius global dapat diatur melalui dashboard pada rentang 0 sampai 200 meter. Nilai 0 memakai koordinat pusat tanpa offset. Pengaturan tersimpan mengambil prioritas atas GEO_RADIUS_METERS di .env; nilai lama/default di atas 200 dibatasi menjadi 200 saat aplikasi startup. Perubahan berlaku pada proses automation berikutnya, bukan page yang sudah menerima koordinat.</w:t>
       </w:r>
     </w:p>
     <w:tbl>
@@ -4472,23 +4544,10 @@
             </w:tcMar>
           </w:tcPr>
           <w:p>
-            <w:pPr>
-              <w:rPr>
-                <w:rFonts w:hint="eastAsia"/>
-              </w:rPr>
-            </w:pPr>
-            <w:r>
-              <w:rPr>
-                <w:sz w:val="18"/>
-              </w:rPr>
+            <w:r>
               <w:t>GEO_RADIUS_METERS=50</w:t>
-            </w:r>
-            <w:r>
-              <w:rPr>
-                <w:sz w:val="18"/>
-              </w:rPr>
               <w:br/>
-              <w:t>Contoh radius; nilai efektif mengikuti konfigurasi instalasi.</w:t>
+              <w:t>Default sebelum pengaturan dashboard tersimpan; batas runtime 0-200 meter.</w:t>
             </w:r>
           </w:p>
         </w:tc>
@@ -4900,7 +4959,7 @@
         </w:rPr>
       </w:pPr>
       <w:r>
-        <w:t>Pada card CALENDAR - Holiday Provider, isi URL Kalender JSON yang didukung.</w:t>
+        <w:t>Pada card CALENDAR - Holiday Provider, isi URL Kalender JSON berupa tautan HTTPS ke data JSON, bukan halaman web biasa. Gunakan endpoint yang didukung seperti contoh di bawah; ekstensi .json bukan syarat mutlak karena endpoint /latest juga mengembalikan JSON.</w:t>
       </w:r>
     </w:p>
     <w:tbl>
@@ -5055,7 +5114,17 @@
         </w:rPr>
       </w:pPr>
       <w:r>
-        <w:t>Restart aplikasi melalui admin server untuk menerapkan pengaturan. Setelah aktif, periksa label waktu dan nyalakan scheduler bila AUTO_START=false.</w:t>
+        <w:t>Setelah timezone tersimpan, konfirmasi kedua menawarkan restart seluruh aplikasi. Pilih konfirmasi hanya saat siap. Jika dibatalkan, pengaturan tetap tersimpan dan tombol Restart Aplikasi dapat digunakan kemudian. Restart otomatis hanya tersedia pada deployment yang dikelola PM2; instalasi tanpa PM2 perlu direstart manual oleh admin server.</w:t>
+      </w:r>
+    </w:p>
+    <w:p>
+      <w:r>
+        <w:t>Selama restart, layar tunggu menutup dashboard dan memeriksa aplikasi secara berkala. Setelah aplikasi kembali siap, halaman diarahkan ke dashboard atau login jika session admin sudah berakhir. Jika belum siap setelah masa tunggu, gunakan Muat Ulang atau hubungi admin server. Jangan menekan restart berulang kali.</w:t>
+      </w:r>
+    </w:p>
+    <w:p>
+      <w:r>
+        <w:t>Restart memakai graceful shutdown yang sudah ada, bukan reload halaman. Pastikan PM2 autorestart aktif. Sesudah login kembali, periksa timezone aktif, hari/tanggal/jam, dan status scheduler. Dengan AUTO_START=false, klik Start Scheduler secara manual setelah siap; restart tidak otomatis memulihkan status Running sebelumnya.</w:t>
       </w:r>
     </w:p>
     <w:p>
@@ -5797,7 +5866,7 @@
         </w:rPr>
       </w:pPr>
       <w:r>
-        <w:t>Default backup terjadwal: Minggu pukul 01:00 sesuai timezone aplikasi. Retention default adalah 4 file terbaru. Nilai aktual mengikuti DB_BACKUP_* di .env, yang baru dibaca setelah restart.</w:t>
+        <w:t>Default backup terjadwal: Minggu pukul 01:00 sesuai timezone aplikasi. Aktif/nonaktif dan retention runtime dapat diubah melalui Pengaturan Operasional tanpa restart. Retention runtime 1 sampai 8 file; default 4. Folder dan cron tetap mengikuti DB_BACKUP_DIR dan DB_BACKUP_CRON di .env. CLI backup memiliki konfigurasi retention tersendiri dari .env; lihat bagian 14.3.</w:t>
       </w:r>
     </w:p>
     <w:tbl>
@@ -6021,16 +6090,8 @@
             </w:tcMar>
           </w:tcPr>
           <w:p>
-            <w:pPr>
-              <w:rPr>
-                <w:rFonts w:hint="eastAsia"/>
-              </w:rPr>
-            </w:pPr>
-            <w:r>
-              <w:rPr>
-                <w:sz w:val="18"/>
-              </w:rPr>
-              <w:t>4 file terbaru secara default, termasuk backup manual dan terjadwal.</w:t>
+            <w:r>
+              <w:t>Default runtime 4 file terbaru; dapat diubah menjadi 1-8 melalui dashboard.</w:t>
             </w:r>
           </w:p>
         </w:tc>
@@ -6182,7 +6243,7 @@
         </w:rPr>
       </w:pPr>
       <w:r>
-        <w:t>Sesudah file baru berhasil dibuat dan tidak kosong, retention mempertahankan 4 file terbaru secara default berdasarkan waktu modifikasi. Sisanya yang cocok pola nama backup di folder tersebut dihapus. Mengubah .env atau restart saja tidak langsung membersihkan file lama. Retention adalah jumlah file, bukan umur 4 hari, dan tidak menghapus arsip rollback di direktori lain.</w:t>
+        <w:t>Sesudah file baru berhasil dibuat dan tidak kosong, retention mempertahankan sejumlah snapshot terbaru sesuai nilai aktif berdasarkan waktu modifikasi. File sisanya yang cocok pola nama backup di folder tersebut dihapus. Menyimpan pengaturan atau restart saja tidak langsung membersihkan file lama. Retention adalah jumlah file, bukan umur dalam hari, dan tidak menghapus arsip rollback di direktori lain. Backup manual dashboard memakai retention runtime yang sama dengan backup terjadwal.</w:t>
       </w:r>
     </w:p>
     <w:p>
@@ -7642,6 +7703,11 @@
       </w:r>
     </w:p>
     <w:p>
+      <w:r>
+        <w:t>Perbedaan penting: admin:backup masih membaca DB_BACKUP_RETENTION_COUNT dari .env, bukan operational_settings. Bila ingin kebijakan yang sama dengan dashboard, admin server perlu menyamakan nilainya secara manual (disarankan 1-8). Mengubah backup runtime menjadi nonaktif tidak menonaktifkan backup manual CLI. Jangan menganggap batas runtime otomatis membatasi operasi CLI.</w:t>
+      </w:r>
+    </w:p>
+    <w:p>
       <w:pPr>
         <w:pStyle w:val="Heading2"/>
       </w:pPr>
@@ -8442,7 +8508,7 @@
         </w:rPr>
       </w:pPr>
       <w:r>
-        <w:t>Pastikan DB_BACKUP_ENABLED=true.</w:t>
+        <w:t>Periksa Backup Otomatis Aktif pada Pengaturan Operasional. Jika belum ada pengaturan database, default mengikuti DB_BACKUP_ENABLED di .env. Backup manual dashboard juga tidak tersedia bila backup dinonaktifkan; CLI admin:backup tetap dapat digunakan oleh admin server.</w:t>
       </w:r>
     </w:p>
     <w:p>
@@ -8944,16 +9010,8 @@
             </w:tcMar>
           </w:tcPr>
           <w:p>
-            <w:pPr>
-              <w:rPr>
-                <w:rFonts w:hint="eastAsia"/>
-              </w:rPr>
-            </w:pPr>
-            <w:r>
-              <w:rPr>
-                <w:sz w:val="18"/>
-              </w:rPr>
-              <w:t>Radius random geolocation.</w:t>
+            <w:r>
+              <w:t>Default radius; dashboard tersimpan mengambil prioritas. Runtime dibatasi 0-200 meter.</w:t>
             </w:r>
           </w:p>
         </w:tc>
@@ -9412,16 +9470,8 @@
             </w:tcMar>
           </w:tcPr>
           <w:p>
-            <w:pPr>
-              <w:rPr>
-                <w:rFonts w:hint="eastAsia"/>
-              </w:rPr>
-            </w:pPr>
-            <w:r>
-              <w:rPr>
-                <w:sz w:val="18"/>
-              </w:rPr>
-              <w:t>Aktifkan weekly backup.</w:t>
+            <w:r>
+              <w:t>Default backup runtime; pengaturan database mengambil prioritas.</w:t>
             </w:r>
           </w:p>
         </w:tc>
@@ -9568,16 +9618,8 @@
             </w:tcMar>
           </w:tcPr>
           <w:p>
-            <w:pPr>
-              <w:rPr>
-                <w:rFonts w:hint="eastAsia"/>
-              </w:rPr>
-            </w:pPr>
-            <w:r>
-              <w:rPr>
-                <w:sz w:val="18"/>
-              </w:rPr>
-              <w:t>Jumlah file snapshot database yang dipertahankan.</w:t>
+            <w:r>
+              <w:t>Default retention. Runtime dashboard dibatasi 1-8; CLI memakai nilai .env tersendiri.</w:t>
             </w:r>
           </w:p>
         </w:tc>
@@ -11633,17 +11675,8 @@
             <w:tcW w:w="5340" w:type="dxa"/>
           </w:tcPr>
           <w:p>
-            <w:pPr>
-              <w:spacing w:after="80"/>
-              <w:rPr>
-                <w:rFonts w:hint="eastAsia"/>
-              </w:rPr>
-            </w:pPr>
-            <w:r>
-              <w:rPr>
-                <w:sz w:val="18"/>
-              </w:rPr>
-              <w:t>Default DB_BACKUP_DIR. Folder efektif mengikuti .env; backup CLI dan dashboard memakai retention yang sama.</w:t>
+            <w:r>
+              <w:t>Default DB_BACKUP_DIR. Folder mengikuti .env. Retention runtime dashboard mengikuti database; CLI backup masih memakai .env.</w:t>
             </w:r>
           </w:p>
         </w:tc>

</xml_diff>

<commit_message>
Amankan perubahan timezone dan restart setelah pekerjaan selesai
- Hentikan generator dan pertahankan jadwal serta retry sebelum restart

- Batasi percobaan timezone dan jeda perubahan 24 jam

- Saring error dashboard dan perbarui panduan serta pengujian
</commit_message>
<xml_diff>
--- a/PANDUAN/Bot-Absensi-Pusaka-Manual-Book-Admin.docx
+++ b/PANDUAN/Bot-Absensi-Pusaka-Manual-Book-Admin.docx
@@ -2613,7 +2613,7 @@
     <w:p>
       <w:pPr/>
       <w:r>
-        <w:t>Catatan rilis: batas 200 meter/8 file, dropdown retensi, layar tunggu restart, dan tata letak terbaru dijelaskan sesuai source lokal. Saat revisi panduan ini, perubahan tersebut belum diuji atau dideploy; pastikan release terpasang sebelum mengandalkan tampilannya di production.</w:t>
+        <w:t>Catatan rilis: panduan mengikuti source lokal. Pastikan release aplikasi sudah diperbarui karena fitur dan tampilan pada instalasi lama dapat berbeda.</w:t>
       </w:r>
     </w:p>
     <w:p>
@@ -5081,7 +5081,7 @@
         </w:rPr>
       </w:pPr>
       <w:r>
-        <w:t>Hentikan scheduler dan tunggu queue, browser, serta proses generator selesai.</w:t>
+        <w:t>Pada card SYSTEM - Core Health, pilih WIB - Asia/Jakarta, WITA - Asia/Makassar, atau WIT - Asia/Jayapura.</w:t>
       </w:r>
     </w:p>
     <w:p>
@@ -5092,7 +5092,7 @@
         </w:rPr>
       </w:pPr>
       <w:r>
-        <w:t>Pastikan tidak ada jadwal pending/processing di database. Bila masih ada, selesaikan melalui alur operasional; jangan menghapus jadwal untuk melewati guard.</w:t>
+        <w:t>Klik Simpan dan baca konfirmasi. Setelah perubahan diterima, timezone tidak dapat diubah lagi selama 24 jam.</w:t>
       </w:r>
     </w:p>
     <w:p>
@@ -5103,7 +5103,7 @@
         </w:rPr>
       </w:pPr>
       <w:r>
-        <w:t>Pada card SYSTEM - Core Health, pilih WIB - Asia/Jakarta, WITA - Asia/Makassar, atau WIT - Asia/Jayapura, lalu Simpan dan konfirmasi.</w:t>
+        <w:t>Generator berhenti membuat jadwal baru. Card info menampilkan bahwa aplikasi akan restart setelah pekerjaan selesai; tidak perlu menghentikan scheduler secara manual.</w:t>
       </w:r>
     </w:p>
     <w:p>
@@ -5114,17 +5114,17 @@
         </w:rPr>
       </w:pPr>
       <w:r>
-        <w:t>Setelah timezone tersimpan, konfirmasi kedua menawarkan restart seluruh aplikasi. Pilih konfirmasi hanya saat siap. Jika dibatalkan, pengaturan tetap tersimpan dan tombol Restart Aplikasi dapat digunakan kemudian. Restart otomatis hanya tersedia pada deployment yang dikelola PM2; instalasi tanpa PM2 perlu direstart manual oleh admin server.</w:t>
-      </w:r>
-    </w:p>
-    <w:p>
-      <w:r>
-        <w:t>Selama restart, layar tunggu menutup dashboard dan memeriksa aplikasi secara berkala. Setelah aplikasi kembali siap, halaman diarahkan ke dashboard atau login jika session admin sudah berakhir. Jika belum siap setelah masa tunggu, gunakan Muat Ulang atau hubungi admin server. Jangan menekan restart berulang kali.</w:t>
-      </w:r>
-    </w:p>
-    <w:p>
-      <w:r>
-        <w:t>Restart memakai graceful shutdown yang sudah ada, bukan reload halaman. Pastikan PM2 autorestart aktif. Sesudah login kembali, periksa timezone aktif, hari/tanggal/jam, dan status scheduler. Dengan AUTO_START=false, klik Start Scheduler secara manual setelah siap; restart tidak otomatis memulihkan status Running sebelumnya.</w:t>
+        <w:t>Jadwal yang sudah ada, termasuk yang belum jatuh tempo dan retry, tetap diselesaikan memakai timezone lama. Setelah semuanya selesai, aplikasi menjalankan graceful shutdown dan restart melalui PM2. Jangan menghapus jadwal untuk mempercepat restart.</w:t>
+      </w:r>
+    </w:p>
+    <w:p>
+      <w:r>
+        <w:t>Maksimal 3 percobaan perubahan dalam 15 menit untuk seluruh sesi admin. Batas dan jeda tetap berlaku setelah logout atau restart. Ikuti waktu perubahan berikutnya yang ditampilkan di dashboard.</w:t>
+      </w:r>
+    </w:p>
+    <w:p>
+      <w:r>
+        <w:t>PM2 harus memakai autorestart. Selama restart, tunggu aplikasi tersedia dan login kembali jika diminta. Periksa timezone aktif; dengan AUTO_START=false, nyalakan scheduler kembali secara manual.</w:t>
       </w:r>
     </w:p>
     <w:p>
@@ -5134,7 +5134,7 @@
         </w:rPr>
       </w:pPr>
       <w:r>
-        <w:t>Timezone tersimpan mengambil prioritas atas TZ .env setelah restart. Jadwal dan log lama tidak dikonversi. Jangan memilih timezone hanya berdasarkan lokasi browser atau mengubahnya ketika task belum selesai.</w:t>
+        <w:t>Timezone tersimpan mengambil prioritas atas TZ di .env setelah restart. Jadwal dan log lama tidak dikonversi. Permintaan perubahan tetap tersimpan bila proses terputus.</w:t>
       </w:r>
     </w:p>
     <w:p>

</xml_diff>